<commit_message>
docs: remove header table dashed boxes from clean resumes
Replace header table/photo cell with centered paragraphs so WPS no
longer shows dotted gridlines around the top block.

Co-authored-by: Ryan19z <Ryan19z@users.noreply.github.com>
</commit_message>
<xml_diff>
--- a/resume-output/docx-clean/Hou-Zhongqi-Overseas-Technical-Support-EN-1page.docx
+++ b/resume-output/docx-clean/Hou-Zhongqi-Overseas-Technical-Support-EN-1page.docx
@@ -2,116 +2,62 @@
 <file path=word/document.xml><?xml version="1.0" encoding="utf-8"?>
 <w:document xmlns:wpc="http://schemas.microsoft.com/office/word/2010/wordprocessingCanvas" xmlns:mo="http://schemas.microsoft.com/office/mac/office/2008/main" xmlns:mc="http://schemas.openxmlformats.org/markup-compatibility/2006" xmlns:mv="urn:schemas-microsoft-com:mac:vml" xmlns:o="urn:schemas-microsoft-com:office:office" xmlns:r="http://schemas.openxmlformats.org/officeDocument/2006/relationships" xmlns:m="http://schemas.openxmlformats.org/officeDocument/2006/math" xmlns:v="urn:schemas-microsoft-com:vml" xmlns:wp14="http://schemas.microsoft.com/office/word/2010/wordprocessingDrawing" xmlns:wp="http://schemas.openxmlformats.org/drawingml/2006/wordprocessingDrawing" xmlns:w10="urn:schemas-microsoft-com:office:word" xmlns:w="http://schemas.openxmlformats.org/wordprocessingml/2006/main" xmlns:w14="http://schemas.microsoft.com/office/word/2010/wordml" xmlns:wpg="http://schemas.microsoft.com/office/word/2010/wordprocessingGroup" xmlns:wpi="http://schemas.microsoft.com/office/word/2010/wordprocessingInk" xmlns:wne="http://schemas.microsoft.com/office/word/2006/wordml" xmlns:wps="http://schemas.microsoft.com/office/word/2010/wordprocessingShape" mc:Ignorable="w14 wp14">
   <w:body>
-    <w:tbl>
-      <w:tblPr>
-        <w:tblW w:type="auto" w:w="0"/>
-        <w:jc w:val="center"/>
-        <w:tblLayout w:type="fixed"/>
-        <w:tblLook w:firstColumn="1" w:firstRow="1" w:lastColumn="0" w:lastRow="0" w:noHBand="0" w:noVBand="1" w:val="04A0"/>
-        <w:tblBorders>
-          <w:top w:val="nil" w:sz="0" w:space="0" w:color="auto"/>
-          <w:left w:val="nil" w:sz="0" w:space="0" w:color="auto"/>
-          <w:bottom w:val="nil" w:sz="0" w:space="0" w:color="auto"/>
-          <w:right w:val="nil" w:sz="0" w:space="0" w:color="auto"/>
-          <w:insideH w:val="nil" w:sz="0" w:space="0" w:color="auto"/>
-          <w:insideV w:val="nil" w:sz="0" w:space="0" w:color="auto"/>
-        </w:tblBorders>
-      </w:tblPr>
-      <w:tblGrid>
-        <w:gridCol w:w="5103"/>
-        <w:gridCol w:w="5103"/>
-      </w:tblGrid>
-      <w:tr>
-        <w:trPr>
-          <w:trHeight w:val="1587" w:hRule="exact"/>
-        </w:trPr>
-        <w:tc>
-          <w:tcPr>
-            <w:tcW w:type="dxa" w:w="8391"/>
-          </w:tcPr>
-          <w:p>
-            <w:pPr>
-              <w:spacing w:before="0" w:after="40" w:line="288" w:lineRule="auto"/>
-              <w:jc w:val="center"/>
-            </w:pPr>
-            <w:r/>
-            <w:r>
-              <w:rPr>
-                <w:rFonts w:ascii="Calibri" w:hAnsi="Calibri" w:eastAsia="微软雅黑"/>
-                <w:b/>
-                <w:sz w:val="40"/>
-              </w:rPr>
-              <w:t>Zhongqi Hou</w:t>
-            </w:r>
-          </w:p>
-          <w:p>
-            <w:pPr>
-              <w:spacing w:before="0" w:after="40" w:line="288" w:lineRule="auto"/>
-              <w:jc w:val="center"/>
-            </w:pPr>
-            <w:r>
-              <w:rPr>
-                <w:rFonts w:ascii="Calibri" w:hAnsi="Calibri" w:eastAsia="微软雅黑"/>
-                <w:b/>
-                <w:sz w:val="20"/>
-              </w:rPr>
-              <w:t>Overseas Technical Support Engineer (Semiconductor Equipment / Robotics · Hybrid) | Shenzhen</w:t>
-            </w:r>
-          </w:p>
-          <w:p>
-            <w:pPr>
-              <w:spacing w:before="0" w:after="40" w:line="288" w:lineRule="auto"/>
-              <w:jc w:val="center"/>
-            </w:pPr>
-            <w:r>
-              <w:rPr>
-                <w:rFonts w:ascii="Calibri" w:hAnsi="Calibri" w:eastAsia="微软雅黑"/>
-                <w:b w:val="0"/>
-                <w:sz w:val="19"/>
-              </w:rPr>
-              <w:t>English-fluent | UK visa (~2 years) | Overseas travel OK (~3×/year, ~1 month) | +86 178-1676-9251 | zhongqi_hou@foxmail.com</w:t>
-            </w:r>
-          </w:p>
-        </w:tc>
-        <w:tc>
-          <w:tcPr>
-            <w:tcW w:type="dxa" w:w="1361"/>
-            <w:tcMar>
-              <w:top w:w="0" w:type="dxa"/>
-              <w:left w:w="40" w:type="dxa"/>
-              <w:bottom w:w="0" w:type="dxa"/>
-              <w:right w:w="0" w:type="dxa"/>
-            </w:tcMar>
-            <w:tcBorders>
-              <w:top w:val="single" w:sz="8" w:space="0" w:color="999999"/>
-              <w:left w:val="single" w:sz="8" w:space="0" w:color="999999"/>
-              <w:bottom w:val="single" w:sz="8" w:space="0" w:color="999999"/>
-              <w:right w:val="single" w:sz="8" w:space="0" w:color="999999"/>
-            </w:tcBorders>
-          </w:tcPr>
-          <w:p>
-            <w:pPr>
-              <w:spacing w:before="560" w:after="0" w:line="276" w:lineRule="auto"/>
-              <w:jc w:val="center"/>
-            </w:pPr>
-            <w:r/>
-            <w:r>
-              <w:rPr>
-                <w:rFonts w:ascii="Calibri" w:hAnsi="Calibri" w:eastAsia="微软雅黑"/>
-                <w:b w:val="0"/>
-                <w:color w:val="999999"/>
-                <w:sz w:val="18"/>
-              </w:rPr>
-              <w:t>Photo</w:t>
-            </w:r>
-          </w:p>
-        </w:tc>
-      </w:tr>
-    </w:tbl>
     <w:p>
       <w:pPr>
-        <w:spacing w:before="0" w:after="40" w:line="276" w:lineRule="auto"/>
+        <w:spacing w:before="40" w:after="60" w:line="288" w:lineRule="auto"/>
+        <w:jc w:val="center"/>
       </w:pPr>
+      <w:r>
+        <w:rPr>
+          <w:rFonts w:ascii="Calibri" w:hAnsi="Calibri" w:eastAsia="微软雅黑"/>
+          <w:b/>
+          <w:sz w:val="40"/>
+        </w:rPr>
+        <w:t>Zhongqi Hou</w:t>
+      </w:r>
+    </w:p>
+    <w:p>
+      <w:pPr>
+        <w:spacing w:before="0" w:after="40" w:line="288" w:lineRule="auto"/>
+        <w:jc w:val="center"/>
+      </w:pPr>
+      <w:r>
+        <w:rPr>
+          <w:rFonts w:ascii="Calibri" w:hAnsi="Calibri" w:eastAsia="微软雅黑"/>
+          <w:b/>
+          <w:sz w:val="20"/>
+        </w:rPr>
+        <w:t>Overseas Technical Support Engineer (Semiconductor Equipment / Robotics · Hybrid) | Shenzhen</w:t>
+      </w:r>
+    </w:p>
+    <w:p>
+      <w:pPr>
+        <w:spacing w:before="0" w:after="40" w:line="288" w:lineRule="auto"/>
+        <w:jc w:val="center"/>
+      </w:pPr>
+      <w:r>
+        <w:rPr>
+          <w:rFonts w:ascii="Calibri" w:hAnsi="Calibri" w:eastAsia="微软雅黑"/>
+          <w:b w:val="0"/>
+          <w:sz w:val="19"/>
+        </w:rPr>
+        <w:t>English-fluent | UK visa (~2 years) | Overseas travel OK (~3×/year, ~1 month) | +86 178-1676-9251 | zhongqi_hou@foxmail.com</w:t>
+      </w:r>
+    </w:p>
+    <w:p>
+      <w:pPr>
+        <w:spacing w:before="0" w:after="80" w:line="276" w:lineRule="auto"/>
+        <w:jc w:val="right"/>
+      </w:pPr>
+      <w:r>
+        <w:rPr>
+          <w:rFonts w:ascii="Calibri" w:hAnsi="Calibri" w:eastAsia="微软雅黑"/>
+          <w:b w:val="0"/>
+          <w:color w:val="999999"/>
+          <w:sz w:val="16"/>
+        </w:rPr>
+        <w:t>（证件照请自行粘贴于右上角）</w:t>
+      </w:r>
     </w:p>
     <w:p>
       <w:pPr>

</xml_diff>